<commit_message>
Regenerate Welcome_and_NDA_Flow.docx + .pdf to reflect updated .txt content.
Picks up Arron's content edits from prior commit: Scott Dix added as development partner co-founder, "good friend and business partner" framing, "thirty-minute foundations guided tour" terminology, and refined extract-not-validate language.

Co-Authored-By: Claude Opus 4.7 (1M context) <noreply@anthropic.com>
</commit_message>
<xml_diff>
--- a/Focus Group Materials/Day-of Operations/Welcome_and_NDA_Flow.docx
+++ b/Focus Group Materials/Day-of Operations/Welcome_and_NDA_Flow.docx
@@ -208,7 +208,7 @@
     </w:p>
     <w:p>
       <w:r>
-        <w:t>This is Nicole. My partner in life and in this. We are co-founding "VirtusFocus" together. Nicole is going to take over the front of the room at 12:15 to walk you through the pitch portion of today, and you'll hear from her again at the end.</w:t>
+        <w:t>This is Nicole. My good friend and business partner in this and other ventures. We are co-founding "VirtusFocus" together along with our development partner Scott Dix. Nicole is going to take over the front of the room at 12:15 to walk you through the pitch portion of today, and you'll hear from her again at the end.</w:t>
       </w:r>
     </w:p>
     <w:p>
@@ -273,7 +273,7 @@
     </w:p>
     <w:p>
       <w:r>
-        <w:t>We've put you into three rough groups for the breakouts later. Coaches and program-builders on one side. Parents, athletes, and youth-program operators on another. Market and strategy people on the third. The packets in front of you indicate which group you're in.</w:t>
+        <w:t>We've put you into three rough groups for the breakouts later. Coaches and program-builders on one side. Parents, athletes, and youth-program operators on another. Market, strategy, and content people on the third. The packets in front of you indicate which group you're in.</w:t>
       </w:r>
     </w:p>
     <w:p>
@@ -301,7 +301,7 @@
     </w:p>
     <w:p>
       <w:r>
-        <w:t>This is a focus group. It is not a pitch. We are not trying to convince you of anything. We are about to put a real product, a real system, and the real shape of our business in front of you, and we are going to ask you to find the cracks.</w:t>
+        <w:t>This is a focus group. It is not a pitch. We are not trying to convince you to invest or purchase anything. We are about to put a real product, a real system, and the real shape of our business in front of you, and we are going to ask you to find the cracks.</w:t>
       </w:r>
     </w:p>
     <w:p>
@@ -311,7 +311,7 @@
     </w:p>
     <w:p>
       <w:r>
-        <w:t>Don't be polite. Be specific. Nicole will repeat that in different words at the end of her pitch, and we will say it again before the breakouts start. We mean it.</w:t>
+        <w:t>Don't be polite. Be specific. Nicole will repeat that in different words at the end of her talk, and we will say it again before the breakouts start. We mean it.</w:t>
       </w:r>
     </w:p>
     <w:p>
@@ -329,17 +329,17 @@
     </w:p>
     <w:p>
       <w:r>
-        <w:t>Right now and for the next fifteen minutes, this. Then Nicole and I are going to do a thirty-minute pitch together. We split it. She opens, I take the middle, she closes. You'll see how it works.</w:t>
+        <w:t>Right now we'll go over some logistics. Then Nicole and I are going to do a thirty-minute foundations guided tour together. We split it. She opens, I take the middle, she closes. You'll see how it works.</w:t>
       </w:r>
     </w:p>
     <w:p>
       <w:r>
-        <w:t>After the pitch, I'll walk you through the app mockups for thirty minutes so you can see what an athlete and a parent and a coach would actually see. The mockups are in active design, not final, but they are far enough along that they're useful for what we're going to ask you in the breakouts.</w:t>
+        <w:t>After the tour, I'll walk you through the app mockups for thirty minutes so you can see what an athlete and a parent and a coach would actually see. The mockups are in active design, not final, but they are far enough along that they're useful for what we're going to ask you in the breakouts.</w:t>
       </w:r>
     </w:p>
     <w:p>
       <w:r>
-        <w:t>Then we eat. Lunch is right here in the room.</w:t>
+        <w:t>Then we eat. Lunch will be right here in the room.</w:t>
       </w:r>
     </w:p>
     <w:p>

</xml_diff>

<commit_message>
Integrate 3 late-RSVP attendees (Gio + Buck + Chris) into Pitch Script Section 4 + Welcome roster.
Pitch Section 4 institutional ask expanded to all 6 names with HS/college role-spectrum acknowledgment and inline HS-context expansion of compliance question. Pitch Section 1 hook trio updated (Bret -> Buck for longest-tenure ~110 years framing; "You" -> "Each of you" for pointed eye-contact; user edit replicated to worktree from main folder). Welcome sign-in roster expanded 3 -> 6 institutional rows; attendee count updated 11-12 -> 14. Both .docx + .pdf regenerated; Capture_Protocol + Breakout_Facilitation_Guide binaries restored unchanged.

Co-Authored-By: Claude Opus 4.7 (1M context) <noreply@anthropic.com>
</commit_message>
<xml_diff>
--- a/Focus Group Materials/Day-of Operations/Welcome_and_NDA_Flow.docx
+++ b/Focus Group Materials/Day-of Operations/Welcome_and_NDA_Flow.docx
@@ -18,7 +18,7 @@
         <w:t xml:space="preserve">Event: </w:t>
       </w:r>
       <w:r>
-        <w:t>May 9, 2026 (Saturday) Venue:        Hampton Inn, 1000 Towne Square Dr, Greensburg Schedule:     11:30-12:00 check-in window | 12:00-12:15 welcome Last updated: 2026-05-01 Owners:       Arron (welcome lead) + Nicole (operational support)</w:t>
+        <w:t>May 9, 2026 (Saturday) Venue:        Hampton Inn, 1000 Towne Square Dr, Greensburg Schedule:     11:30-12:00 check-in window | 12:00-12:15 welcome Last updated: 2026-05-02 Owners:       Arron (welcome lead) + Nicole (operational support)</w:t>
       </w:r>
     </w:p>
     <w:p>
@@ -156,7 +156,7 @@
     </w:p>
     <w:p>
       <w:r>
-        <w:t>OPTIONAL go-around for name introductions can be inserted between Step 2 and Step 3, but with 11-12 attendees plus hosts, that adds 5-7 minutes. RECOMMENDED: skip the go-around. Attendees have name tags (color-coded by segment per pickup notes) and can introduce themselves at lunch. Spend the time on substantive welcome instead.</w:t>
+        <w:t>OPTIONAL go-around for name introductions can be inserted between Step 2 and Step 3, but with 14 attendees plus hosts, that adds 7-10 minutes. RECOMMENDED: skip the go-around. Attendees have name tags (color-coded by segment per pickup notes) and can introduce themselves at lunch. Spend the time on substantive welcome instead.</w:t>
       </w:r>
     </w:p>
     <w:p>
@@ -851,6 +851,12 @@
         <w:t xml:space="preserve">  Bret Colbert     |         |      |          | Inst</w:t>
         <w:br/>
         <w:t xml:space="preserve">  Bob Colbert      |         |      |          | Inst</w:t>
+        <w:br/>
+        <w:t xml:space="preserve">  Gio Vonne Sanders|         |      |          | Inst</w:t>
+        <w:br/>
+        <w:t xml:space="preserve">  Buck Larry       |         |      |          | Inst</w:t>
+        <w:br/>
+        <w:t xml:space="preserve">  Chris Russell    |         |      |          | Inst</w:t>
         <w:br/>
         <w:t xml:space="preserve">  Ron Oswald       |         |      |          | D2C</w:t>
         <w:br/>

</xml_diff>